<commit_message>
BI Mini Project Reports PDFs
</commit_message>
<xml_diff>
--- a/LP-VI/BI/B_Group1_Mini_Project.docx
+++ b/LP-VI/BI/B_Group1_Mini_Project.docx
@@ -3051,7 +3051,7 @@
                 <w:spacing w:val="-5"/>
                 <w:sz w:val="28"/>
               </w:rPr>
-              <w:t>2</w:t>
+              <w:t>0</w:t>
             </w:r>
           </w:p>
         </w:tc>
@@ -3148,7 +3148,15 @@
                 <w:spacing w:val="-5"/>
                 <w:sz w:val="28"/>
               </w:rPr>
-              <w:t>13</w:t>
+              <w:t>1</w:t>
+            </w:r>
+            <w:r>
+              <w:rPr>
+                <w:b/>
+                <w:spacing w:val="-5"/>
+                <w:sz w:val="28"/>
+              </w:rPr>
+              <w:t>1</w:t>
             </w:r>
           </w:p>
         </w:tc>
@@ -3245,7 +3253,15 @@
                 <w:spacing w:val="-5"/>
                 <w:sz w:val="28"/>
               </w:rPr>
-              <w:t>14</w:t>
+              <w:t>1</w:t>
+            </w:r>
+            <w:r>
+              <w:rPr>
+                <w:b/>
+                <w:spacing w:val="-5"/>
+                <w:sz w:val="28"/>
+              </w:rPr>
+              <w:t>2</w:t>
             </w:r>
           </w:p>
         </w:tc>
@@ -3342,7 +3358,15 @@
                 <w:spacing w:val="-5"/>
                 <w:sz w:val="28"/>
               </w:rPr>
-              <w:t>14</w:t>
+              <w:t>1</w:t>
+            </w:r>
+            <w:r>
+              <w:rPr>
+                <w:b/>
+                <w:spacing w:val="-5"/>
+                <w:sz w:val="28"/>
+              </w:rPr>
+              <w:t>2</w:t>
             </w:r>
           </w:p>
         </w:tc>
@@ -7647,6 +7671,7 @@
       </w:pPr>
       <w:r>
         <w:rPr>
+          <w:noProof/>
           <w:u w:val="none"/>
         </w:rPr>
         <w:drawing>
@@ -7696,6 +7721,7 @@
       </w:pPr>
       <w:r>
         <w:rPr>
+          <w:noProof/>
           <w:u w:val="none"/>
         </w:rPr>
         <w:drawing>
@@ -8038,49 +8064,13 @@
         <w:r>
           <w:rPr>
             <w:rStyle w:val="Hyperlink"/>
-            <w:b/>
-            <w:sz w:val="24"/>
-            <w:u w:val="none"/>
           </w:rPr>
-          <w:t>https://github.com/Jenil7828/Sem-VII</w:t>
-        </w:r>
-        <w:r>
-          <w:rPr>
-            <w:rStyle w:val="Hyperlink"/>
-            <w:b/>
-            <w:sz w:val="24"/>
-            <w:u w:val="none"/>
-          </w:rPr>
-          <w:t xml:space="preserve"> </w:t>
-        </w:r>
-        <w:r>
-          <w:rPr>
-            <w:rStyle w:val="Hyperlink"/>
-            <w:b/>
-            <w:sz w:val="24"/>
-            <w:u w:val="none"/>
-          </w:rPr>
-          <w:t>/LP-VI/BI</w:t>
-        </w:r>
-        <w:r>
-          <w:rPr>
-            <w:rStyle w:val="Hyperlink"/>
-            <w:b/>
-            <w:sz w:val="24"/>
-            <w:u w:val="none"/>
-          </w:rPr>
-          <w:t>/Mini-Project</w:t>
-        </w:r>
-        <w:r>
-          <w:rPr>
-            <w:rStyle w:val="Hyperlink"/>
-            <w:b/>
-            <w:sz w:val="24"/>
-            <w:u w:val="none"/>
-          </w:rPr>
-          <w:t>.pbix</w:t>
+          <w:t>https://github.com/Jenil7828/Sem-VII/blob/main/LP-VI/BI/Mini%20Project.pbix</w:t>
         </w:r>
       </w:hyperlink>
+      <w:r>
+        <w:t xml:space="preserve"> </w:t>
+      </w:r>
       <w:r>
         <w:rPr>
           <w:b/>
@@ -10734,6 +10724,7 @@
   <w:style w:type="character" w:default="1" w:styleId="DefaultParagraphFont">
     <w:name w:val="Default Paragraph Font"/>
     <w:uiPriority w:val="1"/>
+    <w:semiHidden/>
     <w:unhideWhenUsed/>
   </w:style>
   <w:style w:type="table" w:default="1" w:styleId="TableNormal">

</xml_diff>